<commit_message>
edits to ms and remove old version table1
</commit_message>
<xml_diff>
--- a/ms-2026-05-10.docx
+++ b/ms-2026-05-10.docx
@@ -1188,7 +1188,97 @@
       </w:r>
       <w:r>
         <w:rPr/>
-        <w:t xml:space="preserve">. By contrast, the 89-type classification distinguishes among deletions of T according to bases preceding or following the sequence of Ts at the site of the deletion. However, it groups together deletions of T from sequences of 1, 2, 3, or 4 T, and groups together deletions of sequences of 5, 6, 7, ,8 and Ts. Thus, for example, deletions of ATA→AA or ATTA→ATA are distinguished from deletions of CTA→CA or CTTA→CTA, but the deletions CTA→CA and CTTTTA→CTTTA have the same classification. The 476-type classification scheme provides fined-grained distinctions among deletions of a single C or T that combine the distinctions in the 83 and 89-type system. The 476-type classification scheme shows, for example, that in the signature in Figure 1 (InsDel23), the most prominent deletions are ATA→AA, CTA→CA, and GTA→GA. The classifications of indels of 2 or more bases are less intuitive. </w:t>
+        <w:t>. By contrast, the 89-type classification distinguishes among deletions of T according to bases preceding or following the sequence of Ts at the site of the deletion. However, it groups together deletions of T from sequences of 1, 2, 3, or 4 T, and groups together deletions of sequences of 5, 6, 7, ,8 and Ts. Thus, for example, deletions of ATA</w:t>
+      </w:r>
+      <w:r>
+        <w:rPr>
+          <w:rFonts w:eastAsia="DejaVu Sans" w:cs="DejaVu Sans" w:hint="eastAsia" w:ascii="DejaVu Sans" w:hAnsi="DejaVu Sans"/>
+        </w:rPr>
+        <w:t>→</w:t>
+      </w:r>
+      <w:r>
+        <w:rPr/>
+        <w:t>AA or ATTA</w:t>
+      </w:r>
+      <w:r>
+        <w:rPr>
+          <w:rFonts w:eastAsia="DejaVu Sans" w:cs="DejaVu Sans" w:hint="eastAsia" w:ascii="DejaVu Sans" w:hAnsi="DejaVu Sans"/>
+        </w:rPr>
+        <w:t>→</w:t>
+      </w:r>
+      <w:r>
+        <w:rPr/>
+        <w:t>ATA are distinguished from deletions of CTA</w:t>
+      </w:r>
+      <w:r>
+        <w:rPr>
+          <w:rFonts w:eastAsia="DejaVu Sans" w:cs="DejaVu Sans" w:hint="eastAsia" w:ascii="DejaVu Sans" w:hAnsi="DejaVu Sans"/>
+        </w:rPr>
+        <w:t>→</w:t>
+      </w:r>
+      <w:r>
+        <w:rPr/>
+        <w:t>CA or CTTA</w:t>
+      </w:r>
+      <w:r>
+        <w:rPr>
+          <w:rFonts w:eastAsia="DejaVu Sans" w:cs="DejaVu Sans" w:hint="eastAsia" w:ascii="DejaVu Sans" w:hAnsi="DejaVu Sans"/>
+        </w:rPr>
+        <w:t>→</w:t>
+      </w:r>
+      <w:r>
+        <w:rPr/>
+        <w:t>CTA, but the deletions CTA</w:t>
+      </w:r>
+      <w:r>
+        <w:rPr>
+          <w:rFonts w:eastAsia="DejaVu Sans" w:cs="DejaVu Sans" w:hint="eastAsia" w:ascii="DejaVu Sans" w:hAnsi="DejaVu Sans"/>
+        </w:rPr>
+        <w:t>→</w:t>
+      </w:r>
+      <w:r>
+        <w:rPr/>
+        <w:t>CA and CTTTTA</w:t>
+      </w:r>
+      <w:r>
+        <w:rPr>
+          <w:rFonts w:eastAsia="DejaVu Sans" w:cs="DejaVu Sans" w:hint="eastAsia" w:ascii="DejaVu Sans" w:hAnsi="DejaVu Sans"/>
+        </w:rPr>
+        <w:t>→</w:t>
+      </w:r>
+      <w:r>
+        <w:rPr/>
+        <w:t>CTTTA have the same classification. The 476-type classification scheme provides fined-grained distinctions among deletions of a single C or T that combine the distinctions in the 83 and 89-type system. The 476-type classification scheme shows, for example, that in the signature in Figure 1 (InsDel23), the most prominent deletions are ATA</w:t>
+      </w:r>
+      <w:r>
+        <w:rPr>
+          <w:rFonts w:eastAsia="DejaVu Sans" w:cs="DejaVu Sans" w:hint="eastAsia" w:ascii="DejaVu Sans" w:hAnsi="DejaVu Sans"/>
+        </w:rPr>
+        <w:t>→</w:t>
+      </w:r>
+      <w:r>
+        <w:rPr/>
+        <w:t>AA, CTA</w:t>
+      </w:r>
+      <w:r>
+        <w:rPr>
+          <w:rFonts w:eastAsia="DejaVu Sans" w:cs="DejaVu Sans" w:hint="eastAsia" w:ascii="DejaVu Sans" w:hAnsi="DejaVu Sans"/>
+        </w:rPr>
+        <w:t>→</w:t>
+      </w:r>
+      <w:r>
+        <w:rPr/>
+        <w:t>CA, and GTA</w:t>
+      </w:r>
+      <w:r>
+        <w:rPr>
+          <w:rFonts w:eastAsia="DejaVu Sans" w:cs="DejaVu Sans" w:hint="eastAsia" w:ascii="DejaVu Sans" w:hAnsi="DejaVu Sans"/>
+        </w:rPr>
+        <w:t>→</w:t>
+      </w:r>
+      <w:r>
+        <w:rPr/>
+        <w:t xml:space="preserve">GA. The classifications of indels of 2 or more bases are less intuitive. </w:t>
       </w:r>
       <w:r>
         <w:rPr>
@@ -1330,14 +1420,27 @@
         <w:rPr>
           <w:shd w:fill="FFFF00" w:val="clear"/>
         </w:rPr>
-        <w:t>(Table 1, shiny app, make a reference for the zenodo site of the vignette; can we get a doi for the shiny app?</w:t>
-      </w:r>
-      <w:r>
-        <w:rPr>
-          <w:rFonts w:eastAsia="宋体" w:hint="eastAsia"/>
-          <w:shd w:fill="FFFF00" w:val="clear"/>
+        <w:t xml:space="preserve">(Table 1, </w:t>
+      </w:r>
+      <w:r>
+        <w:rPr>
+          <w:shd w:fill="00FFFF" w:val="clear"/>
+        </w:rPr>
+        <w:t>shiny app, make a reference for the zenodo site of the vignette; can we get a doi for the shiny app?</w:t>
+      </w:r>
+      <w:r>
+        <w:rPr>
+          <w:rFonts w:eastAsia="宋体" w:hint="eastAsia"/>
+          <w:shd w:fill="00FFFF" w:val="clear"/>
         </w:rPr>
         <w:t xml:space="preserve">, </w:t>
+      </w:r>
+      <w:r>
+        <w:rPr>
+          <w:rFonts w:eastAsia="宋体" w:hint="eastAsia"/>
+          <w:shd w:fill="00FFFF" w:val="clear"/>
+        </w:rPr>
+        <w:t>Ta</w:t>
       </w:r>
       <w:r>
         <w:rPr>
@@ -1345,7 +1448,7 @@
           <w:highlight w:val="cyan"/>
           <w:shd w:fill="FFFF00" w:val="clear"/>
         </w:rPr>
-        <w:t>Table S2-S8</w:t>
+        <w:t>ble S2-S8</w:t>
       </w:r>
       <w:r>
         <w:rPr>
@@ -1437,7 +1540,23 @@
       </w:r>
       <w:r>
         <w:rPr/>
-        <w:t xml:space="preserve"> we used tumor mutational spectra dominated by individual signatures to systematically elucidate correspondences between signatures in these classifiation schemes. </w:t>
+        <w:t xml:space="preserve"> we used tumor mutational spectra dominated by individual signatures to systematically elucidate </w:t>
+      </w:r>
+      <w:r>
+        <w:rPr/>
+        <w:t xml:space="preserve">signature </w:t>
+      </w:r>
+      <w:r>
+        <w:rPr/>
+        <w:t xml:space="preserve">correspondences </w:t>
+      </w:r>
+      <w:r>
+        <w:rPr/>
+        <w:t>across</w:t>
+      </w:r>
+      <w:r>
+        <w:rPr/>
+        <w:t xml:space="preserve"> classifiation schemes. </w:t>
       </w:r>
       <w:r>
         <w:rPr>
@@ -1451,9 +1570,15 @@
       </w:r>
       <w:r>
         <w:rPr>
-          <w:shd w:fill="FFFF00" w:val="clear"/>
-        </w:rPr>
-        <w:t>&lt;cite vignette and shiny app&gt;</w:t>
+          <w:shd w:fill="00FFFF" w:val="clear"/>
+        </w:rPr>
+        <w:t>&lt;cite vignette and shiny ap</w:t>
+      </w:r>
+      <w:r>
+        <w:rPr>
+          <w:shd w:fill="00FFFF" w:val="clear"/>
+        </w:rPr>
+        <w:t>p&gt;</w:t>
       </w:r>
     </w:p>
     <w:p>
@@ -1464,68 +1589,328 @@
       </w:pPr>
       <w:r>
         <w:rPr/>
-        <w:t>In several cases, the 89 and 476 type systems were able to distinguish signatures that the 83-type system merged</w:t>
-      </w:r>
-      <w:r>
-        <w:rPr>
-          <w:shd w:fill="FFFF00" w:val="clear"/>
-        </w:rPr>
-        <w:t xml:space="preserve">. These are clearest and least surprising for deletions of single T bases in the context of tracts of poly-T &gt;= 5 in length and which across the spectra we analyzed are the most numerous among the groupings shown in plots of 89-type spectra, and the the monotonic increase in the numbers of these deletions with increasing length of the poly-T tract is also clear in a 476-type plot of all indels analyzed. </w:t>
-      </w:r>
-    </w:p>
-    <w:p>
-      <w:pPr>
-        <w:pStyle w:val="normalfirst"/>
-        <w:rPr>
-          <w:shd w:fill="FF0000" w:val="clear"/>
-        </w:rPr>
-      </w:pPr>
-      <w:r>
-        <w:rPr>
-          <w:shd w:fill="FF0000" w:val="clear"/>
-        </w:rPr>
-      </w:r>
-    </w:p>
-    <w:p>
-      <w:pPr>
-        <w:pStyle w:val="normalfirst"/>
-        <w:rPr>
-          <w:shd w:fill="FF0000" w:val="clear"/>
-        </w:rPr>
-      </w:pPr>
-      <w:r>
-        <w:rPr>
-          <w:shd w:fill="FF0000" w:val="clear"/>
-        </w:rPr>
-        <w:t>2? add info on assignments</w:t>
-      </w:r>
-    </w:p>
-    <w:p>
-      <w:pPr>
-        <w:pStyle w:val="normalfirst"/>
-        <w:rPr>
-          <w:shd w:fill="FF0000" w:val="clear"/>
-        </w:rPr>
-      </w:pPr>
-      <w:r>
-        <w:rPr>
-          <w:shd w:fill="FF0000" w:val="clear"/>
-        </w:rPr>
-        <w:t>1?</w:t>
+        <w:t>In several cases, the 89 and 476 type systems were able to distinguish signatures that the 83-type sy</w:t>
+      </w:r>
+      <w:r>
+        <w:rPr>
+          <w:shd w:fill="auto" w:val="clear"/>
+        </w:rPr>
+        <w:t>stem merged</w:t>
+      </w:r>
+      <w:r>
+        <w:rPr>
+          <w:shd w:fill="auto" w:val="clear"/>
+        </w:rPr>
+        <w:t xml:space="preserve">. </w:t>
+      </w:r>
+      <w:r>
+        <w:rPr>
+          <w:shd w:fill="auto" w:val="clear"/>
+        </w:rPr>
+        <w:t>This is</w:t>
+      </w:r>
+      <w:r>
+        <w:rPr>
+          <w:shd w:fill="auto" w:val="clear"/>
+        </w:rPr>
+        <w:t xml:space="preserve"> clearest for deletions of single T bases </w:t>
+      </w:r>
+      <w:r>
+        <w:rPr>
+          <w:shd w:fill="auto" w:val="clear"/>
+        </w:rPr>
+        <w:t>from</w:t>
+      </w:r>
+      <w:r>
+        <w:rPr>
+          <w:shd w:fill="auto" w:val="clear"/>
+        </w:rPr>
+        <w:t xml:space="preserve"> tracts of </w:t>
+      </w:r>
+      <w:r>
+        <w:rPr>
+          <w:rFonts w:eastAsia="Liberation Serif" w:cs="Liberation Serif" w:ascii="Liberation Serif" w:hAnsi="Liberation Serif"/>
+          <w:shd w:fill="auto" w:val="clear"/>
+        </w:rPr>
+        <w:t>≥</w:t>
+      </w:r>
+      <w:r>
+        <w:rPr>
+          <w:shd w:fill="auto" w:val="clear"/>
+        </w:rPr>
+        <w:t xml:space="preserve"> </w:t>
+      </w:r>
+      <w:r>
+        <w:rPr>
+          <w:shd w:fill="auto" w:val="clear"/>
+        </w:rPr>
+        <w:t>6</w:t>
+      </w:r>
+      <w:r>
+        <w:rPr>
+          <w:shd w:fill="auto" w:val="clear"/>
+        </w:rPr>
+        <w:t xml:space="preserve"> </w:t>
+      </w:r>
+      <w:r>
+        <w:rPr>
+          <w:shd w:fill="auto" w:val="clear"/>
+        </w:rPr>
+        <w:t xml:space="preserve">Ts, </w:t>
+      </w:r>
+      <w:r>
+        <w:rPr>
+          <w:shd w:fill="auto" w:val="clear"/>
+        </w:rPr>
+        <w:t>which in the older, 83 type classificaiton, consitute a sing</w:t>
+      </w:r>
+      <w:r>
+        <w:rPr>
+          <w:shd w:fill="auto" w:val="clear"/>
+        </w:rPr>
+        <w:t xml:space="preserve">le class of &gt; 8.5 million </w:t>
+      </w:r>
+      <w:r>
+        <w:rPr>
+          <w:shd w:fill="auto" w:val="clear"/>
+        </w:rPr>
+        <w:t>deletions</w:t>
+      </w:r>
+      <w:r>
+        <w:rPr>
+          <w:shd w:fill="auto" w:val="clear"/>
+        </w:rPr>
+        <w:t xml:space="preserve">. </w:t>
+      </w:r>
+      <w:r>
+        <w:rPr>
+          <w:shd w:fill="auto" w:val="clear"/>
+        </w:rPr>
+        <w:t>In COSMIC reference s</w:t>
+      </w:r>
+      <w:r>
+        <w:rPr>
+          <w:shd w:fill="auto" w:val="clear"/>
+        </w:rPr>
+        <w:t xml:space="preserve">ignature ID2 in the 83-type classification consists exclusively of this class </w:t>
+      </w:r>
+      <w:r>
+        <w:rPr>
+          <w:shd w:fill="auto" w:val="clear"/>
+        </w:rPr>
+        <w:t>of deletions</w:t>
+      </w:r>
+      <w:r>
+        <w:rPr>
+          <w:shd w:fill="auto" w:val="clear"/>
+        </w:rPr>
+        <w:t xml:space="preserve">. </w:t>
+      </w:r>
+      <w:r>
+        <w:rPr>
+          <w:shd w:fill="auto" w:val="clear"/>
+        </w:rPr>
+        <w:t>The new indel classifications divide ID2 into th</w:t>
+      </w:r>
+      <w:r>
+        <w:rPr>
+          <w:shd w:fill="auto" w:val="clear"/>
+        </w:rPr>
+        <w:t>ree classes.</w:t>
+      </w:r>
+      <w:r>
+        <w:rPr>
+          <w:shd w:fill="auto" w:val="clear"/>
+        </w:rPr>
+        <w:t xml:space="preserve"> </w:t>
+      </w:r>
+      <w:r>
+        <w:rPr>
+          <w:shd w:fill="auto" w:val="clear"/>
+        </w:rPr>
+        <w:t xml:space="preserve">Among these, InsDel2b is dominated by deletions of T from tracts of 5 to 7 Ts. </w:t>
+      </w:r>
+      <w:r>
+        <w:rPr>
+          <w:shd w:fill="auto" w:val="clear"/>
+        </w:rPr>
+        <w:t xml:space="preserve">InsDel2a </w:t>
+      </w:r>
+      <w:r>
+        <w:rPr>
+          <w:shd w:fill="auto" w:val="clear"/>
+        </w:rPr>
+        <w:t>and</w:t>
+      </w:r>
+      <w:r>
+        <w:rPr>
+          <w:shd w:fill="auto" w:val="clear"/>
+        </w:rPr>
+        <w:t xml:space="preserve"> InsDel2c </w:t>
+      </w:r>
+      <w:r>
+        <w:rPr>
+          <w:shd w:fill="auto" w:val="clear"/>
+        </w:rPr>
+        <w:t xml:space="preserve">are dominated by deletions of </w:t>
+      </w:r>
+      <w:r>
+        <w:rPr>
+          <w:rFonts w:eastAsia="Liberation Serif" w:cs="Liberation Serif" w:ascii="Liberation Serif" w:hAnsi="Liberation Serif"/>
+          <w:shd w:fill="auto" w:val="clear"/>
+        </w:rPr>
+        <w:t xml:space="preserve">≥ </w:t>
+      </w:r>
+      <w:r>
+        <w:rPr>
+          <w:rFonts w:eastAsia="Liberation Serif" w:cs="Liberation Serif" w:ascii="Liberation Serif" w:hAnsi="Liberation Serif"/>
+          <w:shd w:fill="auto" w:val="clear"/>
+        </w:rPr>
+        <w:t>8 Ts but are distinguised by InsDel2a’s preference of flanking A bases and InsDelc’s preference for flanking C bases.</w:t>
+      </w:r>
+      <w:r>
+        <w:rPr>
+          <w:shd w:fill="auto" w:val="clear"/>
+        </w:rPr>
+        <w:t xml:space="preserve"> </w:t>
+      </w:r>
+      <w:r>
+        <w:rPr>
+          <w:color w:val="000000"/>
+          <w:shd w:fill="auto" w:val="clear"/>
+        </w:rPr>
+        <w:t xml:space="preserve">Insdel2a and InsDel2b are strongly enriched among MSI-H tumors </w:t>
+      </w:r>
+      <w:r>
+        <w:rPr>
+          <w:color w:val="000000"/>
+          <w:shd w:fill="00FFFF" w:val="clear"/>
+        </w:rPr>
+        <w:t>&lt;reference new plot based on fisher test?&gt;</w:t>
+      </w:r>
+      <w:r>
+        <w:rPr>
+          <w:color w:val="000000"/>
+          <w:shd w:fill="auto" w:val="clear"/>
+        </w:rPr>
+        <w:t>.</w:t>
       </w:r>
     </w:p>
     <w:p>
       <w:pPr>
         <w:pStyle w:val="normalfirst"/>
         <w:ind w:firstLine="720"/>
-        <w:rPr>
-          <w:shd w:fill="FFFF00" w:val="clear"/>
-        </w:rPr>
-      </w:pPr>
-      <w:r>
-        <w:rPr>
-          <w:shd w:fill="FFFF00" w:val="clear"/>
-        </w:rPr>
+        <w:rPr/>
+      </w:pPr>
+      <w:r>
+        <w:rPr>
+          <w:shd w:fill="auto" w:val="clear"/>
+        </w:rPr>
+        <w:t>The ability of the 89 and 476-type systems to distinugish signatures that the 83 type merged was also</w:t>
+      </w:r>
+      <w:r>
+        <w:rPr>
+          <w:shd w:fill="auto" w:val="clear"/>
+        </w:rPr>
+        <w:t xml:space="preserve"> clea</w:t>
+      </w:r>
+      <w:r>
+        <w:rPr>
+          <w:shd w:fill="auto" w:val="clear"/>
+        </w:rPr>
+        <w:t xml:space="preserve">r for </w:t>
+      </w:r>
+      <w:r>
+        <w:rPr>
+          <w:shd w:fill="auto" w:val="clear"/>
+        </w:rPr>
+        <w:t>insertions of</w:t>
+      </w:r>
+      <w:r>
+        <w:rPr>
+          <w:shd w:fill="auto" w:val="clear"/>
+        </w:rPr>
+        <w:t xml:space="preserve"> of single T bases </w:t>
+      </w:r>
+      <w:r>
+        <w:rPr>
+          <w:shd w:fill="auto" w:val="clear"/>
+        </w:rPr>
+        <w:t xml:space="preserve">into </w:t>
+      </w:r>
+      <w:r>
+        <w:rPr>
+          <w:shd w:fill="auto" w:val="clear"/>
+        </w:rPr>
+        <w:t xml:space="preserve">tracts of </w:t>
+      </w:r>
+      <w:r>
+        <w:rPr>
+          <w:rFonts w:eastAsia="Liberation Serif" w:cs="Liberation Serif" w:ascii="Liberation Serif" w:hAnsi="Liberation Serif"/>
+          <w:shd w:fill="auto" w:val="clear"/>
+        </w:rPr>
+        <w:t>≥</w:t>
+      </w:r>
+      <w:r>
+        <w:rPr>
+          <w:shd w:fill="auto" w:val="clear"/>
+        </w:rPr>
+        <w:t xml:space="preserve"> </w:t>
+      </w:r>
+      <w:r>
+        <w:rPr>
+          <w:shd w:fill="auto" w:val="clear"/>
+        </w:rPr>
+        <w:t>5</w:t>
+      </w:r>
+      <w:r>
+        <w:rPr>
+          <w:shd w:fill="auto" w:val="clear"/>
+        </w:rPr>
+        <w:t xml:space="preserve"> </w:t>
+      </w:r>
+      <w:r>
+        <w:rPr>
+          <w:shd w:fill="auto" w:val="clear"/>
+        </w:rPr>
+        <w:t>T</w:t>
+      </w:r>
+      <w:r>
+        <w:rPr>
+          <w:shd w:fill="auto" w:val="clear"/>
+        </w:rPr>
+        <w:t xml:space="preserve">s. In the 83-type classification these constitute a single class of &gt; 3.3 million insertions, and COSMIC reference signature ID1 in the 83-type system consists exclusivly of this class of insertions. InsDel1a has the largest proportion of insertions into tracts of </w:t>
+      </w:r>
+      <w:r>
+        <w:rPr>
+          <w:rFonts w:eastAsia="Liberation Serif" w:cs="Liberation Serif" w:ascii="Liberation Serif" w:hAnsi="Liberation Serif"/>
+          <w:shd w:fill="auto" w:val="clear"/>
+        </w:rPr>
+        <w:t>≥</w:t>
+      </w:r>
+      <w:r>
+        <w:rPr>
+          <w:shd w:fill="auto" w:val="clear"/>
+        </w:rPr>
+        <w:t xml:space="preserve"> 8T and InsDel1b has the smallest proportion, while InsDel1c has an intermediate proportion. Compared to InsDel1b, InsDel1a and InsDel1c have larger proportions of A to the left of the poly-T tract and G to right, and smaller proportions of C to the lef</w:t>
+      </w:r>
+      <w:r>
+        <w:rPr>
+          <w:shd w:fill="auto" w:val="clear"/>
+        </w:rPr>
+        <w:t xml:space="preserve">t of the poly-T tract with C or A to the right. Several tumor with high propoportions of InsDel1b (&gt; 0.4) have mutationions in the proofreading domain of polymerase epsilon </w:t>
+      </w:r>
+      <w:r>
+        <w:rPr>
+          <w:shd w:fill="00FFFF" w:val="clear"/>
+        </w:rPr>
+        <w:t>&lt;references for pole, table s9, Koh (InD15)&gt;</w:t>
+      </w:r>
+      <w:r>
+        <w:rPr>
+          <w:shd w:fill="auto" w:val="clear"/>
+        </w:rPr>
+        <w:t>.</w:t>
       </w:r>
     </w:p>
     <w:p>
@@ -1538,7 +1923,13 @@
         <w:rPr>
           <w:rFonts w:eastAsia="宋体" w:hint="eastAsia"/>
         </w:rPr>
-        <w:t>Conversely, there were two cases in which the 83-type and 476 type systems clearly differentiated signatures that were almost identical the 89-type system. One case consisted of InsDel13 and C with are nearly identical in the 89-type system because it combines deletion of single Ts in stretches of 1, 2, 3, or 4 Ts. However the 83 and 476 type systems show that InsDelC has deletions of 1 T from ATA (ATA</w:t>
+        <w:t>However</w:t>
+      </w:r>
+      <w:r>
+        <w:rPr>
+          <w:rFonts w:eastAsia="宋体" w:hint="eastAsia"/>
+        </w:rPr>
+        <w:t>, there were two cases in which the 83-type and 476 type systems clearly differentiated signatures that were almost identical the 89-type system. One case consisted of InsDel13 and C with are nearly identical in the 89-type system because it combines deletion of single Ts in stretches of 1, 2, 3, or 4 Ts. However the 83 and 476 type systems show that InsDelC has deletions of 1 T from ATA (ATA</w:t>
       </w:r>
       <w:r>
         <w:rPr>
@@ -1562,11 +1953,24 @@
         <w:rPr>
           <w:rFonts w:eastAsia="宋体" w:hint="eastAsia"/>
         </w:rPr>
-        <w:t>ATA, Sup Figure S1A</w:t>
-      </w:r>
-      <w:r>
-        <w:rPr/>
-        <w:t>).</w:t>
+        <w:t>ATA,</w:t>
+      </w:r>
+      <w:r>
+        <w:rPr>
+          <w:rFonts w:eastAsia="宋体" w:hint="eastAsia"/>
+          <w:shd w:fill="00FFFF" w:val="clear"/>
+        </w:rPr>
+        <w:t xml:space="preserve"> Sup Figure S1A</w:t>
+      </w:r>
+      <w:r>
+        <w:rPr>
+          <w:shd w:fill="00FFFF" w:val="clear"/>
+        </w:rPr>
+        <w:t>)</w:t>
+      </w:r>
+      <w:r>
+        <w:rPr/>
+        <w:t>.</w:t>
       </w:r>
       <w:r>
         <w:rPr>
@@ -1586,7 +1990,55 @@
         <w:rPr>
           <w:rFonts w:eastAsia="宋体" w:hint="eastAsia"/>
         </w:rPr>
-        <w:t>The other case consisted of InsDel11 and InsDel16. InsDel11 has insertions of one C next to an isolated C (C with non-Cs on each side, e.g. ACG→ACCG) and insertion of a one T next to an isolated T (e.g. GTG→GTTG), while InsDel16, has insertion of one C between non-Cs (e.g. AT→ACT), and insertion of one T between non-Ts (e.g. AG→ATG Sup Figure S1B</w:t>
+        <w:t>The other case consisted of InsDel11 and InsDel16. InsDel11 has insertions of one C next to an isolated C (C with non-Cs on each side, e.g. ACG</w:t>
+      </w:r>
+      <w:r>
+        <w:rPr>
+          <w:rFonts w:eastAsia="DejaVu Sans" w:cs="DejaVu Sans" w:hint="eastAsia" w:ascii="DejaVu Sans" w:hAnsi="DejaVu Sans"/>
+        </w:rPr>
+        <w:t>→</w:t>
+      </w:r>
+      <w:r>
+        <w:rPr>
+          <w:rFonts w:eastAsia="宋体" w:hint="eastAsia"/>
+        </w:rPr>
+        <w:t>ACCG) and insertion of a one T next to an isolated T (e.g. GTG</w:t>
+      </w:r>
+      <w:r>
+        <w:rPr>
+          <w:rFonts w:eastAsia="DejaVu Sans" w:cs="DejaVu Sans" w:hint="eastAsia" w:ascii="DejaVu Sans" w:hAnsi="DejaVu Sans"/>
+        </w:rPr>
+        <w:t>→</w:t>
+      </w:r>
+      <w:r>
+        <w:rPr>
+          <w:rFonts w:eastAsia="宋体" w:hint="eastAsia"/>
+        </w:rPr>
+        <w:t>GTTG), while InsDel16, has insertion of one C between non-Cs (e.g. AT</w:t>
+      </w:r>
+      <w:r>
+        <w:rPr>
+          <w:rFonts w:eastAsia="DejaVu Sans" w:cs="DejaVu Sans" w:hint="eastAsia" w:ascii="DejaVu Sans" w:hAnsi="DejaVu Sans"/>
+        </w:rPr>
+        <w:t>→</w:t>
+      </w:r>
+      <w:r>
+        <w:rPr>
+          <w:rFonts w:eastAsia="宋体" w:hint="eastAsia"/>
+        </w:rPr>
+        <w:t>ACT), and insertion of one T between non-Ts (e.g. AG</w:t>
+      </w:r>
+      <w:r>
+        <w:rPr>
+          <w:rFonts w:eastAsia="DejaVu Sans" w:cs="DejaVu Sans" w:hint="eastAsia" w:ascii="DejaVu Sans" w:hAnsi="DejaVu Sans"/>
+        </w:rPr>
+        <w:t>→</w:t>
+      </w:r>
+      <w:r>
+        <w:rPr>
+          <w:rFonts w:eastAsia="宋体" w:hint="eastAsia"/>
+        </w:rPr>
+        <w:t>ATG Sup Figure S1B</w:t>
       </w:r>
       <w:r>
         <w:rPr/>
@@ -1805,7 +2257,7 @@
       </w:pPr>
       <w:r>
         <w:rPr/>
-        <w:t>&lt;but this sentence above in subsection on splitting 1 and 2&gt; When an 83-type signature corresponded to multiple 89-type signatures, such as C_ID1 being represented by InsDel1a, InsDel1b, and InsDel1c, these subdivided signatures often exhibited cancer type specificity or reflected distinct mutational processes. C_ID1 was present across nearly all cancer types. InsDel1a showed the highest prevalence in most cancer types and exhibited moderate activity levels. In contrast, InsDel1b accounted for a greater number of mutations in colon cancer and was associated with POLE deficiency and impaired DNA mismatch repair (</w:t>
+        <w:t>&lt;but this sentence above in subsection on splitting 1 and 2&gt; , InsDel1b accounted for a greater number of mutations in colon cancer and was associated with POLE deficiency and impaired DNA mismatch repair (</w:t>
       </w:r>
       <w:commentRangeStart w:id="0"/>
       <w:r>

</xml_diff>